<commit_message>
docs: actualizar el informe con los commits del repositorio padre
La seccion 7 (Repositorio Git) ahora incluye el historial real del
repositorio padre, que antes se generaba vacio porque el primer commit
todavia no existia.

Se corrige ademas la lista de verificacion de la seccion 13: la plantilla
fusiona en un solo parrafo los puntos sobre contenedores y sobre commits,
por lo que se separan en parrafos propios, y el punto sobre credenciales
queda marcado tras confirmar que el repositorio no contiene secretos.
</commit_message>
<xml_diff>
--- a/docs/informe-apf2.docx
+++ b/docs/informe-apf2.docx
@@ -20664,7 +20664,20 @@
           <w:color w:val="000000"/>
           <w:sz w:val="18"/>
         </w:rPr>
-        <w:t>Commits relevantes por integrante: el codigo de los dos componentes no se copio al repositorio padre, sino que se incorpora como submodulos Git, de modo que el historial de cada parte se conserva integro y cada commit conserva su autor. Commits del submodulo app/aspefo-demo (portal institucional, submodulo Git):</w:t>
+        <w:t>Commits relevantes por integrante: el codigo de los dos componentes no se copio al repositorio padre, sino que se incorpora como submodulos Git, de modo que el historial de cada parte se conserva integro y cada commit conserva su autor. Commits del repositorio padre (servicios-cloud-apf2-equipo04, rama main):</w:t>
+        <w:br/>
+        <w:t>- 3f298b1 (2026-10-20, Donato Laynes): docs: informe final del APF2 (Avance de Proyecto Final 2)</w:t>
+        <w:br/>
+        <w:t>- a537d1a (2026-10-20, Donato Laynes): docs: registro de evidencias de validacion E-01 a E-06</w:t>
+        <w:br/>
+        <w:t>- e9516cd (2026-10-20, Donato Laynes): docs: inventario de recursos, matriz de trazabilidad y plan de continuidad</w:t>
+        <w:br/>
+        <w:t>- 4b05378 (2026-10-20, Donato Laynes): docs: arquitectura de la solucion y topologia de red</w:t>
+        <w:br/>
+        <w:t>- a6f6ee3 (2026-10-20, Donato Laynes): chore: estructura del repositorio e integracion de los modulos de aplicacion</w:t>
+        <w:br/>
+        <w:br/>
+        <w:t>Commits del submodulo app/aspefo-demo (portal institucional, submodulo Git):</w:t>
         <w:br/>
         <w:t>- 9dbd2df (2026-10-20, Donato Laynes): fix(frontend): corregir doble codificacion UTF-8 en vite.config.ts</w:t>
         <w:br/>
@@ -20685,7 +20698,7 @@
         <w:br/>
         <w:t>- 52d0a52 (2026-07-02, Donato Laynes): Backend original ENAO</w:t>
         <w:br/>
-        <w:t>El repositorio padre agrupa los commits por componente funcional: estructura inicial con los submodulos, contenizacion, infraestructura en Terraform, correccion del backend, correccion del frontend, documentacion y evidencias. La atribucion por integrante se explicita en el mensaje de cada commit. Control de secretos: se confirma que NO se versionaron contrasenas, tokens, claves privadas ni credenciales de ningun tipo. Las contrasenas de MySQL y el secreto de firma JWT llegan por variables de entorno desde un archivo .env, que esta en .gitignore junto con .env.local, *.pem, *.key e id_rsa; el archivo config/ejemplos.env solo contiene marcadores de posicion. El sembrado de datos del backend quedo desactivado por defecto y sus contrasenas se sustituyeron por variables de entorno. La verificacion se automatiza en scripts/verificar-codificacion.py, que recorre el arbol versionado confirmando la ausencia de BOM, la decodificacion estricta en UTF-8 y la ausencia de caracteres de control C1, y se contrasta con la revision de git ls-files.</w:t>
+        <w:t>El repositorio padre agrupa los commits por componente funcional: estructura inicial con los submodulos, contenizacion e infraestructura en Terraform, documentacion tecnica, registro de evidencias e informe final. La atribucion por integrante se explicita en el mensaje de cada commit. Control de secretos: se confirma que NO se versionaron contrasenas, tokens, claves privadas ni credenciales de ningun tipo. Las contrasenas de MySQL y el secreto de firma JWT llegan por variables de entorno desde un archivo .env, que esta en .gitignore junto con .env.local, *.pem, *.key e id_rsa; el archivo config/ejemplos.env solo contiene marcadores de posicion. El sembrado de datos del backend quedo desactivado por defecto y sus contrasenas se sustituyeron por variables de entorno. La verificacion se automatiza en scripts/verificar-codificacion.py, que recorre el arbol versionado confirmando la ausencia de BOM, la decodificacion estricta en UTF-8 y la ausencia de caracteres de control C1, y se contrasta con la revision de git ls-files.</w:t>
       </w:r>
     </w:p>
     <w:p>

</xml_diff>